<commit_message>
Revise Nausicaa chapter and introduction
</commit_message>
<xml_diff>
--- a/jdown/docx/odisea5_nausicaa.docx
+++ b/jdown/docx/odisea5_nausicaa.docx
@@ -23,7 +23,7 @@
         <w:pStyle w:val="FirstParagraph"/>
       </w:pPr>
       <w:r>
-        <w:t xml:space="preserve">A los quince años, durante mi primera y arrebatada lectura de la</w:t>
+        <w:t xml:space="preserve">Durante mi primera y arrebatada lectura de la</w:t>
       </w:r>
       <w:r>
         <w:t xml:space="preserve"> </w:t>
@@ -36,7 +36,7 @@
         <w:t xml:space="preserve">Odisea</w:t>
       </w:r>
       <w:r>
-        <w:t xml:space="preserve">, las diosas que aparecían en ella me inspiraban reverencia —Hera, Atenea, Calipso y Helena, que contaba como divinidad— y Penélope era como mi madre, que también se había pasado largas temporadas esperando a mi padre, durante los años que este estaba embarcado, aunque mi madre, con su picante sentido del humor, era bastante más divertida que la reina de Ítaca, siempre seria, tejiendo y destejiendo una mortaja. En cuanto a Circe, me daba un poco de miedo: con aquella hechicera valían pocas bromas. Lo mismo te convertía en cerdo que te mandaba de excursión al Hades. Me imponía tanto, de hecho, que no me atrevía a enamorarme de ella. No aquella primera vez, quiero decir. Todo se andaría.</w:t>
+        <w:t xml:space="preserve">, las diosas que aparecían en ella me inspiraban reverencia —Hera, Atenea, Calipso y Helena, que contaba como divinidad— y Penélope era como mi madre, que también se había pasado largas temporadas esperando a mi padre, durante los años que este estaba embarcado, aunque mi madre, con su picante sentido del humor, era bastante más divertida que la reina de Ítaca, siempre seria, tejiendo y destejiendo una mortaja. En cuanto a Circe, me daba un poco de miedo; con aquella hechicera valían pocas bromas. Lo mismo te convertía en cerdo que te mandaba de excursión al Hades. Me imponía tanto, de hecho, que no me atrevía a enamorarme de ella. No aquella primera vez, quiero decir. Todo se andaría.</w:t>
       </w:r>
     </w:p>
     <w:p>
@@ -252,7 +252,7 @@
         <w:pStyle w:val="FirstParagraph"/>
       </w:pPr>
       <w:r>
-        <w:t xml:space="preserve">Todavía muchacha, como nos asegura la diosa, así que es difícil que pase de los quince. Ya le rondan los pretendientes, eso sí, su boda está cercana y yo, tumbado en una hamaca del Mar Menor, a la hora de la siesta, cuando lo único que se oía era el canto de los grillos, me moría de celos.</w:t>
+        <w:t xml:space="preserve">Todavía muchacha, como nos asegura la diosa, así que es difícil que pase de los quince. Ya le rondan los pretendientes, eso sí, su boda está cercana y yo, tumbado en una hamaca del Mar Menor, a la hora de la siesta, me moría de celos.</w:t>
       </w:r>
     </w:p>
     <w:p>
@@ -421,7 +421,7 @@
         <w:t xml:space="preserve"> </w:t>
       </w:r>
       <w:r>
-        <w:t xml:space="preserve">(páter phíle), «padre querido». Al bueno de Nolan lo han puesto de vuelta y media debido al «dad» que suelta Telémaco al hablar de su padre. Son ganas de fijarse en nimiedades, pero lo cierto es que en el pueblo en que crecí —Alba no es su nombre, pero así me gusta llamarlo— los hijos todavía trataban a sus padres de usted y empleaban, en catalán, el vocativo formal «pare». En toda la</w:t>
+        <w:t xml:space="preserve">(páter phíle), «padre querido». Al bueno de Nolan lo han puesto de vuelta y media debido al «dad» que suelta Telémaco al hablar de su viejo. Son ganas de fijarse en nimiedades, pero lo cierto es que en Alba, el pueblo en que crecí, los hijos todavía trataban a sus padres de usted y empleaban, en catalán, el vocativo formal «pare». En toda la</w:t>
       </w:r>
       <w:r>
         <w:t xml:space="preserve"> </w:t>
@@ -492,7 +492,7 @@
         <w:pStyle w:val="FirstParagraph"/>
       </w:pPr>
       <w:r>
-        <w:t xml:space="preserve">Todo el canto VI se caracteriza por una paz sutil, en contraste con la sucesión de catástrofes que han castigado al héroe —y con la violencia que aún queda por llegar— y por unos personajes a cuál más gentil. La escena entre Nausícaa y Alcínoo, la hemos vivido todos los que hemos tenido la suerte de tener una hija. Vuelvo a leer las líneas que me hacían vibrar de pasión juvenil hace cinco décadas y esta vez lo que se apodera de mi corazón es la nostalgia de aquellas mañanas de domingo, cuando Irene me colmaba de carantoñas antes de exponer su astuto plan, sabiendo que nada de lo que me pidiera le negaría. Unos pocos versos capaces de conectar a dos adolescentes y dos padres, separados por tres mil años. Misterios de la relatividad general. Misterios de la poesía. Einstein y Homero.</w:t>
+        <w:t xml:space="preserve">Todo el canto VI se caracteriza por una paz sutil, en contraste con la sucesión de catástrofes que han castigado al héroe —y con la violencia que aún queda por llegar— y por unos personajes a cuál más gentil. La escena entre Nausícaa y Alcínoo, la hemos vivido todos los que hemos tenido la suerte de tener una hija. Vuelvo a leer las líneas que me hacían vibrar de pasión juvenil hace cinco décadas y esta vez lo que se apodera de mi corazón es la nostalgia de aquellas mañanas de domingo, cuando Irene me colmaba de carantoñas antes de exponer su astuto plan, sabiendo que nada de lo que me pidiera le negaría. Unos pocos versos capaces de conectar a dos muchachas adolescentes y dos padres enamorados, separados por tres mil años. Misterios de la relatividad general. Misterios de la poesía.</w:t>
       </w:r>
     </w:p>
     <w:p>
@@ -534,7 +534,7 @@
         <w:pStyle w:val="FirstParagraph"/>
       </w:pPr>
       <w:r>
-        <w:t xml:space="preserve">Terminados la lavandería y el almuerzo, siguen con brío y, en ausencia de pantallas, se ponen a jugar a la pelota:</w:t>
+        <w:t xml:space="preserve">Terminados el lavado y el almuerzo, siguen con brío y, en ausencia de pantallas, se ponen a jugar a la pelota:</w:t>
       </w:r>
     </w:p>
     <w:p>
@@ -682,7 +682,7 @@
         <w:pStyle w:val="FirstParagraph"/>
       </w:pPr>
       <w:r>
-        <w:t xml:space="preserve">En lo que lleva de viaje, a Ulises casi lo descabezan los lestrigones, lo convierte Circe en cerdo, o se lo comen Polifemo y Escila. Ulises no las tiene todas consigo:</w:t>
+        <w:t xml:space="preserve">En lo que lleva de viaje, a Ulises casi lo descabezan los lestrigones, casi lo convierte Circe en cerdo o casi se lo comen Polifemo y Escila. Así que no las tiene todas consigo:</w:t>
       </w:r>
     </w:p>
     <w:p>
@@ -964,7 +964,7 @@
         <w:pStyle w:val="FirstParagraph"/>
       </w:pPr>
       <w:r>
-        <w:t xml:space="preserve">Derrotado como está, Ulises no ha perdido la labia. O quizá sus palabras no sean simple cortesía. Puede que —como a mi yo de entonces— la visión de la princesa lo haya fulminado y el fervor que anuncia sea real. Pero no está en condiciones de hacer otra cosa que suplicar y esa indefensión conmueve al lector y a la princesa:</w:t>
+        <w:t xml:space="preserve">Derrotado como está, Ulises no ha perdido la labia. O quizá sus palabras no sean simple cortesía. Puede que —como a mi yo de entonces— la visión de la princesa lo haya fulminado y el fervor que anuncia sea real. Pero no está en condiciones de hacer otra cosa que suplicar y esa indefensión conmueve al lector y a la muchacha:</w:t>
       </w:r>
     </w:p>
     <w:p>
@@ -1121,7 +1121,7 @@
         <w:t xml:space="preserve">xenía</w:t>
       </w:r>
       <w:r>
-        <w:t xml:space="preserve">), esto es, a ser hospitalarios —no por virtud, por cierto, sino por precaución, ya que el forastero al que se recibe bien podría ser un dios disfrazado—. Ulises y los aqueos toman Troya con un engaño, saltándose esa ley y precipitando, según el argumento del film, la caída de la civilización y el final de la edad de bronce. Es una tesis un poco extrema, pero nuestro bienamado director se aferra a ella como a un clavo ardiendo. Quizás por eso suprime de la película uno de los capítulos más importantes de la</w:t>
+        <w:t xml:space="preserve">), esto es, a ser hospitalarios —no por virtud, por cierto, sino por precaución, ya que el forastero al que se recibe bien podría ser un dios disfrazado—. Ulises y los aqueos toman Troya con un engaño, saltándose, según afirma el osado director, esa ley y precipitando la caída de la civilización y el final de la edad de bronce. Es una tesis un poco extrema, sobre todo porque aqueos y troyanos están en guerra y la treta del caballo no involucra una petición de hospitalidad sino un abuso del sentimiento religioso —o más plausiblemente del orgullo de los de Ilión que se sienten vencedores—. Pero el caso es que nuestro fílmico caballero se aferra a ella como a un clavo ardiendo. Quizás por eso suprime de la película uno de los capítulos más importantes de la</w:t>
       </w:r>
       <w:r>
         <w:t xml:space="preserve"> </w:t>
@@ -1134,7 +1134,7 @@
         <w:t xml:space="preserve">Odisea</w:t>
       </w:r>
       <w:r>
-        <w:t xml:space="preserve">, ya que Nausícaa y los feacios suponen un contraejemplo a su pesimismo. Y en mi opinión eso es un pecado capital, que puede suponerle varios siglos de purgatorio. No solo elimina uno de los personajes más adorables —quizás el más adorable, en todos los sentidos— de la épica de Homero, sino que borra las pruebas que no le convienen a su narrativa un poco estrecha de miras.</w:t>
+        <w:t xml:space="preserve">, ya que Nausícaa y los feacios suponen un contraejemplo a su pesimismo. Y en mi opinión eso es un pecado capital, que puede suponerle a sir Christopher varios siglos de purgatorio. No solo elimina uno de los personajes más adorables —quizás el más adorable, en todos los sentidos— de la épica de Homero, sino que borra las pruebas que no le convienen a su narrativa un poco estrecha de miras.</w:t>
       </w:r>
     </w:p>
     <w:p>
@@ -1331,7 +1331,7 @@
         <w:pStyle w:val="BodyText"/>
       </w:pPr>
       <w:r>
-        <w:t xml:space="preserve">Pero como tiene tanto de decidida como de hermosa, enseguida informa al náufrago de que se dispone a llevarlo al palacio de su padre y le da instrucciones para entrar en la ciudad. Como no tiene un pelo de tonta, le avisa de que tienen que andarse alerta para evitar las malas lenguas que podrían decir algo como esto:</w:t>
+        <w:t xml:space="preserve">Tan decidida como hermosa, enseguida informa al náufrago de que se dispone a llevarlo al palacio de su padre y le da instrucciones para entrar en la ciudad. Como no tiene un pelo de tonta, le avisa de que tienen que andarse alerta para evitar las malas lenguas que podrían decir algo como esto:</w:t>
       </w:r>
     </w:p>
     <w:p>
@@ -1727,7 +1727,7 @@
         <w:t xml:space="preserve">Odisea</w:t>
       </w:r>
       <w:r>
-        <w:t xml:space="preserve">, es polifacética y uno de los ángulos que muestra su historia es el de la posibilidad —o no— de una relación amorosa entre una muchacha de quince años y un hombre mayor que le lleva tres o cuatro décadas. Homero se adelanta a Nabokov en tres milenios, pero la princesa de los feacios no es Lolita.</w:t>
+        <w:t xml:space="preserve">, es polifacética y uno de los ángulos que muestra su historia es el de la posibilidad —o no— de una relación amorosa entre una muchacha de quince años y un hombre mayor que le lleva tres o cuatro décadas. Homero se adelanta a Nabokov en tres milenios, pero la princesa de los feacios no tiene nada de Lolita.</w:t>
       </w:r>
     </w:p>
     <w:p>
@@ -1735,7 +1735,7 @@
         <w:pStyle w:val="BodyText"/>
       </w:pPr>
       <w:r>
-        <w:t xml:space="preserve">Nausícaa es el amor imposible por partida doble. No solo la pierde el héroe atormentado y ya canoso que arriba a sus costas. La pierde también el adolescente que se quería poner en la piel de Ulises, como si un cordero pudiera suplantar a un león. Nausícaa es tan universal como Helena y Penélope, como Calipso y Circe, y lo es porque todos guardamos en nuestro corazón la imagen de esa muchacha que un día nos dedicó una sonrisa, una mirada, puede que un beso. Todos atesoramos, como un dulce y lacerante filtro, ese amor que pudo ser y no fue. Todos seguimos amando a Nausícaa.</w:t>
+        <w:t xml:space="preserve">Nausícaa es el amor imposible por partida doble. No solo la pierde el héroe atormentado y ya canoso que arriba a sus costas. La pierde también el adolescente que fui un día, el adolescente afiebrado que se quería poner en la piel de Ulises, como si un cordero pudiera suplantar a un león. Nausícaa es tan universal como Helena y Penélope, como Calipso y Circe, y lo es porque todos guardamos en nuestro corazón la imagen de esa muchacha que un día nos dedicó una sonrisa, una mirada, puede que un beso. Todos atesoramos, como un dulce y lacerante filtro, ese amor que pudo ser y no fue. Todos seguimos amando a Nausícaa.</w:t>
       </w:r>
     </w:p>
     <w:sectPr>

</xml_diff>

<commit_message>
Revisa Calipso, Nausícaa y Esqueria
</commit_message>
<xml_diff>
--- a/jdown/docx/odisea5_nausicaa.docx
+++ b/jdown/docx/odisea5_nausicaa.docx
@@ -21,6 +21,13 @@
     <w:p>
       <w:pPr>
         <w:pStyle w:val="FirstParagraph"/>
+      </w:pPr>
+      <w:bookmarkStart w:id="9" w:name="cap:nausicaa"/>
+      <w:bookmarkEnd w:id="9"/>
+    </w:p>
+    <w:p>
+      <w:pPr>
+        <w:pStyle w:val="BodyText"/>
       </w:pPr>
       <w:r>
         <w:t xml:space="preserve">Durante mi primera y arrebatada lectura de la</w:t>
@@ -36,7 +43,7 @@
         <w:t xml:space="preserve">Odisea</w:t>
       </w:r>
       <w:r>
-        <w:t xml:space="preserve">, las diosas que aparecían en ella me inspiraban reverencia —Hera, Atenea, Calipso y Helena, que contaba como divinidad— y Penélope era como mi madre, que también se había pasado largas temporadas esperando a mi padre, durante los años que este estaba embarcado, aunque mi madre, con su picante sentido del humor, era bastante más divertida que la reina de Ítaca, siempre seria, tejiendo y destejiendo una mortaja. En cuanto a Circe, me daba un poco de miedo; con aquella hechicera valían pocas bromas. Lo mismo te convertía en cerdo que te mandaba de excursión al Hades. Me imponía tanto, de hecho, que no me atrevía a enamorarme de ella. No aquella primera vez, quiero decir. Todo se andaría.</w:t>
+        <w:t xml:space="preserve">, las diosas que aparecían en ella me inspiraban reverencia —Hera, Atenea, Calipso y Helena, que contaba como divinidad— y Penélope era como mi madre, que también se había pasado largas temporadas esperando a mi viejo, durante los años que este estaba embarcado, aunque ella, con su picante sentido del humor, era bastante más divertida que la reina de Ítaca, siempre seria, tejiendo y destejiendo una mortaja. En cuanto a Circe, me daba un poco de miedo, con aquella hechicera valían pocas bromas. Lo mismo te convertía en cerdo que te mandaba de excursión al Hades. Me imponía tanto, de hecho, que no me atrevía a enamorarme de ella. No aquella primera vez, quiero decir. Todo se andaría.</w:t>
       </w:r>
     </w:p>
     <w:p>
@@ -464,7 +471,7 @@
         <w:pStyle w:val="FirstParagraph"/>
       </w:pPr>
       <w:r>
-        <w:t xml:space="preserve">Y yo leía y no sabía cómo teletransportarme a Corfú —había leído que el país de los feacios coincidía con la bella isla griega— y defender a mi amada de todos aquellos moscones, innombrados, que la pretendían. El rey Alcínoo, por su parte, no es capaz de negarle nada a su pequeña:</w:t>
+        <w:t xml:space="preserve">Y yo leía y no sabía cómo teletransportarme a Corfú —había leído que el país de los feacios coincidía con la bella isla griega— y defender a mi amada de todos aquellos moscones innombrados que la pretendían. El rey Alcínoo, por su parte, no es capaz de negarle nada a su pequeña:</w:t>
       </w:r>
     </w:p>
     <w:p>
@@ -1096,32 +1103,558 @@
         <w:pStyle w:val="FirstParagraph"/>
       </w:pPr>
       <w:r>
-        <w:t xml:space="preserve">El tema central de la película de Nolan puede resumirse así: la ley de Zeus obliga a los hombres a la</w:t>
+        <w:t xml:space="preserve">Nausícaa no solo es valiente, también es generosa. Después de presentarse llama a las esclavas asustadas:</w:t>
+      </w:r>
+    </w:p>
+    <w:p>
+      <w:pPr>
+        <w:pStyle w:val="BlockText"/>
+      </w:pPr>
+      <w:r>
+        <w:t xml:space="preserve">Dijo; y en ese momento llamó a las beltrenzas esclavas:</w:t>
+      </w:r>
+      <w:r>
+        <w:br/>
+      </w:r>
+      <w:r>
+        <w:t xml:space="preserve">«Alto ahí, muchachas; ¿adónde escapáis porque un hombre nos salga?</w:t>
+      </w:r>
+      <w:r>
+        <w:br/>
+      </w:r>
+      <w:r>
+        <w:t xml:space="preserve">¿Pensáis acaso que es uno de esos que viene de malas?</w:t>
+      </w:r>
+      <w:r>
+        <w:br/>
+      </w:r>
+      <w:r>
+        <w:t xml:space="preserve">Aún no respira ese hombre mortal, y tal vez nunca nazca,</w:t>
+      </w:r>
+      <w:r>
+        <w:br/>
+      </w:r>
+      <w:r>
+        <w:t xml:space="preserve">que de los hombres feacios la tierra venga a tocarla</w:t>
+      </w:r>
+      <w:r>
+        <w:br/>
+      </w:r>
+      <w:r>
+        <w:t xml:space="preserve">trayendo calamidad: tanto y más los sin muerte nos guardan.</w:t>
+      </w:r>
+      <w:r>
+        <w:br/>
+      </w:r>
+      <w:r>
+        <w:t xml:space="preserve">Lejos, muy lejos vivimos, en la tempestuosa maralta,</w:t>
+      </w:r>
+      <w:r>
+        <w:br/>
+      </w:r>
+      <w:r>
+        <w:t xml:space="preserve">el fin del mundo, y con otros mortales no hay trato ni alianzas.</w:t>
+      </w:r>
+      <w:r>
+        <w:br/>
+      </w:r>
+      <w:r>
+        <w:t xml:space="preserve">Pero nos llega ahora un triste errabundo y debemos sin falta</w:t>
+      </w:r>
+      <w:r>
+        <w:br/>
+      </w:r>
+      <w:r>
+        <w:t xml:space="preserve">darle atención, pues que toda la gente mendiga o extraña</w:t>
+      </w:r>
+      <w:r>
+        <w:br/>
+      </w:r>
+      <w:r>
+        <w:t xml:space="preserve">gente es de Zeus, y el regalo que des, aun pequeño, le agrada.</w:t>
+      </w:r>
+      <w:r>
+        <w:br/>
+      </w:r>
+      <w:r>
+        <w:t xml:space="preserve">Dadle, así, esclavas, a este hombre extranjero bebida y pitanza, y</w:t>
+      </w:r>
+      <w:r>
+        <w:br/>
+      </w:r>
+      <w:r>
+        <w:t xml:space="preserve">bañadlo bien en el río, y que abrigo del viento allí haya».</w:t>
+      </w:r>
+    </w:p>
+    <w:p>
+      <w:pPr>
+        <w:pStyle w:val="FirstParagraph"/>
+      </w:pPr>
+      <w:r>
+        <w:t xml:space="preserve">Pero Ulises, pudoroso, le pide a las muchachas que le dejen arreglarse solo. Así lo hace, un poco apartado, y Atenea aprovecha para maquillarlo divinalmente, así que cuando sale a la vista, está hecho un brazo de mar.</w:t>
+      </w:r>
+    </w:p>
+    <w:p>
+      <w:pPr>
+        <w:pStyle w:val="BlockText"/>
+      </w:pPr>
+      <w:r>
+        <w:t xml:space="preserve">Fue él a sentarse después, apartándose un poco, a la playa,</w:t>
+      </w:r>
+      <w:r>
+        <w:br/>
+      </w:r>
+      <w:r>
+        <w:t xml:space="preserve">resplandeciente en gracia y belleza. Ella bien lo miraba.</w:t>
+      </w:r>
+      <w:r>
+        <w:br/>
+      </w:r>
+      <w:r>
+        <w:t xml:space="preserve">Y, contemplándolo, dijo a las ondulihermosas esclavas:</w:t>
+      </w:r>
+    </w:p>
+    <w:p>
+      <w:pPr>
+        <w:pStyle w:val="BlockText"/>
+      </w:pPr>
+      <w:r>
+        <w:t xml:space="preserve">«Niñas de brazos de leche, oíd lo que voy a deciros.</w:t>
+      </w:r>
+      <w:r>
+        <w:br/>
+      </w:r>
+      <w:r>
+        <w:t xml:space="preserve">No mal de grado de todos los dioses que alberga el Olimpo</w:t>
+      </w:r>
+      <w:r>
+        <w:br/>
+      </w:r>
+      <w:r>
+        <w:t xml:space="preserve">viene a encontrarse este hombre aquí con los feacios divinos;</w:t>
+      </w:r>
+      <w:r>
+        <w:br/>
+      </w:r>
+      <w:r>
+        <w:t xml:space="preserve">que es que creí que era un ser en verdad poco apuesto al principio,</w:t>
+      </w:r>
+      <w:r>
+        <w:br/>
+      </w:r>
+      <w:r>
+        <w:t xml:space="preserve">y ahora es igual a los dioses, del ancho cielo inquilinos.</w:t>
+      </w:r>
+      <w:r>
+        <w:br/>
+      </w:r>
+      <w:r>
+        <w:t xml:space="preserve">Ay, si uno así a mí me fuera llamado ya esposo mío</w:t>
+      </w:r>
+      <w:r>
+        <w:br/>
+      </w:r>
+      <w:r>
+        <w:t xml:space="preserve">viviendo aquí, porque en gusto quedarse por siempre le vino…</w:t>
+      </w:r>
+      <w:r>
+        <w:br/>
+      </w:r>
+      <w:r>
+        <w:t xml:space="preserve">Ah, dad comida y bebida, esclavas, al desconocido».</w:t>
+      </w:r>
+    </w:p>
+    <w:p>
+      <w:pPr>
+        <w:pStyle w:val="FirstParagraph"/>
+      </w:pPr>
+      <w:r>
+        <w:t xml:space="preserve">El patito (o más bien el ganso) feo se ha convertido en un apuesto galán por obra y gracia de Atenea, que de paso habrá aprovechado para quitarle alguna cana; tanto, que a la princesa le da por pensar que uno así no sería mal marido.</w:t>
+      </w:r>
+    </w:p>
+    <w:p>
+      <w:pPr>
+        <w:pStyle w:val="BodyText"/>
+      </w:pPr>
+      <w:r>
+        <w:t xml:space="preserve">Tan decidida como hermosa, enseguida informa al náufrago de que se dispone a llevarlo al palacio de su padre y le da instrucciones para entrar en la ciudad. Como no tiene un pelo de tonta, le avisa de que tienen que andarse alerta para evitar las malas lenguas que podrían decir algo como esto:</w:t>
+      </w:r>
+    </w:p>
+    <w:p>
+      <w:pPr>
+        <w:pStyle w:val="BlockText"/>
+      </w:pPr>
+      <w:r>
+        <w:t xml:space="preserve">«¿Quién será ese que sigue a Nausícaa, tan grande y garrido</w:t>
+      </w:r>
+      <w:r>
+        <w:br/>
+      </w:r>
+      <w:r>
+        <w:t xml:space="preserve">y forastero? ¿De dónde salió? Se me da que un marido.</w:t>
+      </w:r>
+      <w:r>
+        <w:br/>
+      </w:r>
+      <w:r>
+        <w:t xml:space="preserve">Sí, se lo habrá ella llevado cuando él se extravió del navío,</w:t>
+      </w:r>
+      <w:r>
+        <w:br/>
+      </w:r>
+      <w:r>
+        <w:t xml:space="preserve">que es de otra tierra, y lejana, que aquí no tenemos vecinos;</w:t>
+      </w:r>
+      <w:r>
+        <w:br/>
+      </w:r>
+      <w:r>
+        <w:t xml:space="preserve">o a ella, tras mucho rezar, algún dios biendeseado le vino</w:t>
+      </w:r>
+      <w:r>
+        <w:br/>
+      </w:r>
+      <w:r>
+        <w:t xml:space="preserve">caído del cielo, y por todos sus días lo tenga consigo.</w:t>
+      </w:r>
+      <w:r>
+        <w:br/>
+      </w:r>
+      <w:r>
+        <w:t xml:space="preserve">Tanto mejor si, rodando y rodando, a encontrar fue marido</w:t>
+      </w:r>
+      <w:r>
+        <w:br/>
+      </w:r>
+      <w:r>
+        <w:t xml:space="preserve">en otra parte, pues que a estos de aquí no los tiene por dignos,</w:t>
+      </w:r>
+      <w:r>
+        <w:br/>
+      </w:r>
+      <w:r>
+        <w:t xml:space="preserve">a los feacios, y muchos la rondan, y muy distinguidos».</w:t>
+      </w:r>
+    </w:p>
+    <w:p>
+      <w:pPr>
+        <w:pStyle w:val="FirstParagraph"/>
+      </w:pPr>
+      <w:r>
+        <w:t xml:space="preserve">El tema del matrimonio con el extranjero sigue dando vueltas en el relato, pero también el de la maledicencia, y eso que todavía no se habían inventado las redes sociales:</w:t>
+      </w:r>
+    </w:p>
+    <w:p>
+      <w:pPr>
+        <w:pStyle w:val="BlockText"/>
+      </w:pPr>
+      <w:r>
+        <w:t xml:space="preserve">Así dirán, y eso sí para mí que sería un ultraje.</w:t>
+      </w:r>
+      <w:r>
+        <w:br/>
+      </w:r>
+      <w:r>
+        <w:t xml:space="preserve">Y que lo viera yo en otra, a mí llegaría a indignarme,</w:t>
+      </w:r>
+      <w:r>
+        <w:br/>
+      </w:r>
+      <w:r>
+        <w:t xml:space="preserve">si ella a pesar de los suyos, viviéndole el padre y la madre,</w:t>
+      </w:r>
+      <w:r>
+        <w:br/>
+      </w:r>
+      <w:r>
+        <w:t xml:space="preserve">a hombre se ajunta, en lugar de ir a boda, y con pueblo delante.</w:t>
+      </w:r>
+    </w:p>
+    <w:p>
+      <w:pPr>
+        <w:pStyle w:val="FirstParagraph"/>
+      </w:pPr>
+      <w:r>
+        <w:t xml:space="preserve">Así que la princesa le pide a Odiseo que espere en un bosquecillo cercano para que no los vean llegar juntos. Después —le explica— podrá dirigirse al palacio de su padre y pedir audiencia. El canto VI termina de una manera curiosa y muy homérica. No olvidemos que Atenea lleva todo el episodio enredando. Pues bien, cuando Ulises se queda por fin solo en el bosque, le pide que le ayude a hacer amistad con los feacios:</w:t>
+      </w:r>
+    </w:p>
+    <w:p>
+      <w:pPr>
+        <w:pStyle w:val="BlockText"/>
+      </w:pPr>
+      <w:r>
+        <w:t xml:space="preserve">«Óyeme, cría de Zeus cabrilámpigo, tú, Intemerenda:</w:t>
+      </w:r>
+      <w:r>
+        <w:br/>
+      </w:r>
+      <w:r>
+        <w:t xml:space="preserve">préstame ahora el oído que no me prestaste cuando era</w:t>
+      </w:r>
+      <w:r>
+        <w:br/>
+      </w:r>
+      <w:r>
+        <w:t xml:space="preserve">un hombre roto cuando me rompía el que atrema la tierra.</w:t>
+      </w:r>
+      <w:r>
+        <w:br/>
+      </w:r>
+      <w:r>
+        <w:t xml:space="preserve">Hazme a los feacios amigo y digno de condolencia».</w:t>
+      </w:r>
+    </w:p>
+    <w:p>
+      <w:pPr>
+        <w:pStyle w:val="FirstParagraph"/>
+      </w:pPr>
+      <w:r>
+        <w:t xml:space="preserve">¿Y qué hace Atenea? Pues le da por acordarse de que tío Poseidón tiene muy malas pulgas y prefiere, por una vez, estarse quietecita:</w:t>
+      </w:r>
+    </w:p>
+    <w:p>
+      <w:pPr>
+        <w:pStyle w:val="BlockText"/>
+      </w:pPr>
+      <w:r>
+        <w:t xml:space="preserve">Dijo rezándole así, y Palas Atena lo oía.</w:t>
+      </w:r>
+      <w:r>
+        <w:br/>
+      </w:r>
+      <w:r>
+        <w:t xml:space="preserve">Pero a sus ojos no se apareció, pues respeto tenía</w:t>
+      </w:r>
+      <w:r>
+        <w:br/>
+      </w:r>
+      <w:r>
+        <w:t xml:space="preserve">a ese su tío de padre, tozudo en rencor todavía</w:t>
+      </w:r>
+      <w:r>
+        <w:br/>
+      </w:r>
+      <w:r>
+        <w:t xml:space="preserve">contra Odiseo pardiós, mientras diera en su tierra algún día.</w:t>
+      </w:r>
+    </w:p>
+    <w:p>
+      <w:pPr>
+        <w:pStyle w:val="FirstParagraph"/>
+      </w:pPr>
+      <w:r>
+        <w:t xml:space="preserve">En</w:t>
       </w:r>
       <w:r>
         <w:t xml:space="preserve"> </w:t>
-      </w:r>
-      <w:r>
-        <w:rPr>
-          <w:lang w:val="el"/>
-        </w:rPr>
-        <w:t xml:space="preserve">ξενία</w:t>
-      </w:r>
-      <w:r>
-        <w:t xml:space="preserve"> </w:t>
-      </w:r>
-      <w:r>
-        <w:t xml:space="preserve">(</w:t>
       </w:r>
       <w:r>
         <w:rPr>
           <w:i/>
           <w:iCs/>
         </w:rPr>
-        <w:t xml:space="preserve">xenía</w:t>
-      </w:r>
-      <w:r>
-        <w:t xml:space="preserve">), esto es, a ser hospitalarios —no por virtud, por cierto, sino por precaución, ya que el forastero al que se recibe bien podría ser un dios disfrazado—. Ulises y los aqueos toman Troya con un engaño, saltándose, según afirma el osado director, esa ley y precipitando la caída de la civilización y el final de la edad de bronce. Es una tesis un poco extrema, sobre todo porque aqueos y troyanos están en guerra y la treta del caballo no involucra una petición de hospitalidad sino un abuso del sentimiento religioso —o más plausiblemente del orgullo de los de Ilión que se sienten vencedores—. Pero el caso es que nuestro fílmico caballero se aferra a ella como a un clavo ardiendo. Quizás por eso suprime de la película uno de los capítulos más importantes de la</w:t>
+        <w:t xml:space="preserve">Abandonando Ítaca</w:t>
+      </w:r>
+      <w:r>
+        <w:t xml:space="preserve">, me pongo en la piel de Odiseo, recordando en Ítaca aquella mañana de encuentros afortunados y aquel momento de soledad en el bosque sagrado de Atenea. A diferencia de Homero, que rara vez se demora en una introspección sostenida, mi viejo Ulises se debate entre la nostalgia y los remordimientos.</w:t>
+      </w:r>
+    </w:p>
+    <w:p>
+      <w:pPr>
+        <w:pStyle w:val="BlockText"/>
+      </w:pPr>
+      <w:r>
+        <w:t xml:space="preserve">Cada vez que cierras tus ojos al tenderte en la arena,</w:t>
+      </w:r>
+      <w:r>
+        <w:br/>
+      </w:r>
+      <w:r>
+        <w:t xml:space="preserve">la ves. A la hermosa princesa,</w:t>
+      </w:r>
+      <w:r>
+        <w:br/>
+      </w:r>
+      <w:r>
+        <w:t xml:space="preserve">jugando con sus criadas. Todas</w:t>
+      </w:r>
+      <w:r>
+        <w:br/>
+      </w:r>
+      <w:r>
+        <w:t xml:space="preserve">estaban desnudas, y su belleza te ahogaba,</w:t>
+      </w:r>
+      <w:r>
+        <w:br/>
+      </w:r>
+      <w:r>
+        <w:t xml:space="preserve">más que el azul desierto del que habías</w:t>
+      </w:r>
+      <w:r>
+        <w:br/>
+      </w:r>
+      <w:r>
+        <w:t xml:space="preserve">escapado por poco.</w:t>
+      </w:r>
+      <w:r>
+        <w:br/>
+      </w:r>
+      <w:r>
+        <w:t xml:space="preserve">No salió en estampida como las demás, ni fue tímida. En cambio, tú,</w:t>
+      </w:r>
+      <w:r>
+        <w:br/>
+      </w:r>
+      <w:r>
+        <w:t xml:space="preserve">que habías violado a muchas vírgenes,</w:t>
+      </w:r>
+      <w:r>
+        <w:br/>
+      </w:r>
+      <w:r>
+        <w:t xml:space="preserve">apenas podías pronunciar palabra. Es cierto que</w:t>
+      </w:r>
+      <w:r>
+        <w:br/>
+      </w:r>
+      <w:r>
+        <w:t xml:space="preserve">estabas también desnudo, pero no avergonzado</w:t>
+      </w:r>
+      <w:r>
+        <w:br/>
+      </w:r>
+      <w:r>
+        <w:t xml:space="preserve">de tu fuerte cuerpo. Tal vez fue algo nuevo,</w:t>
+      </w:r>
+      <w:r>
+        <w:br/>
+      </w:r>
+      <w:r>
+        <w:t xml:space="preserve">por primera vez viste lo que sus ojos vieron observándote,</w:t>
+      </w:r>
+      <w:r>
+        <w:br/>
+      </w:r>
+      <w:r>
+        <w:t xml:space="preserve">un mendigo, un náufrago, pidiendo clemencia.</w:t>
+      </w:r>
+    </w:p>
+    <w:p>
+      <w:pPr>
+        <w:pStyle w:val="FirstParagraph"/>
+      </w:pPr>
+      <w:r>
+        <w:t xml:space="preserve">Y no le queda otra que reconocer unos sentimientos que quizás negó incluso ante sí mismo en aquel momento.</w:t>
+      </w:r>
+    </w:p>
+    <w:p>
+      <w:pPr>
+        <w:pStyle w:val="BlockText"/>
+      </w:pPr>
+      <w:r>
+        <w:t xml:space="preserve">¿La amabas? Tal vez sí,</w:t>
+      </w:r>
+      <w:r>
+        <w:br/>
+      </w:r>
+      <w:r>
+        <w:t xml:space="preserve">pero nunca te atreviste a admitirlo,</w:t>
+      </w:r>
+      <w:r>
+        <w:br/>
+      </w:r>
+      <w:r>
+        <w:t xml:space="preserve">ni siquiera a ti mismo. En su lugar,</w:t>
+      </w:r>
+      <w:r>
+        <w:br/>
+      </w:r>
+      <w:r>
+        <w:t xml:space="preserve">noche tras noche seguías desgranando</w:t>
+      </w:r>
+      <w:r>
+        <w:br/>
+      </w:r>
+      <w:r>
+        <w:t xml:space="preserve">tus largas travesías y aventuras salvajes,</w:t>
+      </w:r>
+      <w:r>
+        <w:br/>
+      </w:r>
+      <w:r>
+        <w:t xml:space="preserve">el viaje sin fin que te había arrojado</w:t>
+      </w:r>
+      <w:r>
+        <w:br/>
+      </w:r>
+      <w:r>
+        <w:t xml:space="preserve">junto a sus costas.</w:t>
+      </w:r>
+    </w:p>
+    <w:p>
+      <w:pPr>
+        <w:pStyle w:val="FirstParagraph"/>
+      </w:pPr>
+      <w:r>
+        <w:t xml:space="preserve">Y cuestionarse —es el momento de cuestionárselo todo— si mantuvo su decisión de volver a casa por convicción o cobardía.</w:t>
+      </w:r>
+    </w:p>
+    <w:p>
+      <w:pPr>
+        <w:pStyle w:val="BlockText"/>
+      </w:pPr>
+      <w:r>
+        <w:t xml:space="preserve">¿Tomaste en consideración quedarte?</w:t>
+      </w:r>
+      <w:r>
+        <w:br/>
+      </w:r>
+      <w:r>
+        <w:t xml:space="preserve">Su padre habría estado contento de casar a su hija</w:t>
+      </w:r>
+      <w:r>
+        <w:br/>
+      </w:r>
+      <w:r>
+        <w:t xml:space="preserve">con el último héroe que quedaba de Troya.</w:t>
+      </w:r>
+      <w:r>
+        <w:br/>
+      </w:r>
+      <w:r>
+        <w:t xml:space="preserve">Pero decidiste volver,</w:t>
+      </w:r>
+      <w:r>
+        <w:br/>
+      </w:r>
+      <w:r>
+        <w:t xml:space="preserve">por el bien de Penélope.</w:t>
+      </w:r>
+      <w:r>
+        <w:br/>
+      </w:r>
+      <w:r>
+        <w:t xml:space="preserve">¿O fue otra la razón?</w:t>
+      </w:r>
+      <w:r>
+        <w:br/>
+      </w:r>
+      <w:r>
+        <w:t xml:space="preserve">Tal vez sencillamente no pudiste olvidar lo que viste en su rostro:</w:t>
+      </w:r>
+      <w:r>
+        <w:br/>
+      </w:r>
+      <w:r>
+        <w:t xml:space="preserve">una joven sintiendo compasión por un anciano.</w:t>
+      </w:r>
+    </w:p>
+    <w:p>
+      <w:pPr>
+        <w:pStyle w:val="FirstParagraph"/>
+      </w:pPr>
+      <w:r>
+        <w:t xml:space="preserve">Nausícaa, como todas las mujeres de la</w:t>
       </w:r>
       <w:r>
         <w:t xml:space="preserve"> </w:t>
@@ -1134,7 +1667,7 @@
         <w:t xml:space="preserve">Odisea</w:t>
       </w:r>
       <w:r>
-        <w:t xml:space="preserve">, ya que Nausícaa y los feacios suponen un contraejemplo a su pesimismo. Y en mi opinión eso es un pecado capital, que puede suponerle a sir Christopher varios siglos de purgatorio. No solo elimina uno de los personajes más adorables —quizás el más adorable, en todos los sentidos— de la épica de Homero, sino que borra las pruebas que no le convienen a su narrativa un poco estrecha de miras.</w:t>
+        <w:t xml:space="preserve">, es polifacética y uno de los ángulos que muestra su historia es el de la posibilidad —o no— de una relación amorosa entre una muchacha de quince años y un hombre mayor que le lleva tres o cuatro décadas. Homero se adelanta a Nabokov en tres milenios, pero la princesa de los feacios no tiene nada de Lolita.</w:t>
       </w:r>
     </w:p>
     <w:p>
@@ -1142,600 +1675,7 @@
         <w:pStyle w:val="BodyText"/>
       </w:pPr>
       <w:r>
-        <w:t xml:space="preserve">Por si no queda claro que los feacios respetan la</w:t>
-      </w:r>
-      <w:r>
-        <w:t xml:space="preserve"> </w:t>
-      </w:r>
-      <w:r>
-        <w:rPr>
-          <w:lang w:val="el"/>
-        </w:rPr>
-        <w:t xml:space="preserve">ξενία</w:t>
-      </w:r>
-      <w:r>
-        <w:t xml:space="preserve"> </w:t>
-      </w:r>
-      <w:r>
-        <w:t xml:space="preserve">al pie de la letra, Nausícaa dice:</w:t>
-      </w:r>
-    </w:p>
-    <w:p>
-      <w:pPr>
-        <w:pStyle w:val="BlockText"/>
-      </w:pPr>
-      <w:r>
-        <w:t xml:space="preserve">Dijo; y en ese momento llamó a las beltrenzas esclavas:</w:t>
-      </w:r>
-      <w:r>
-        <w:br/>
-      </w:r>
-      <w:r>
-        <w:t xml:space="preserve">«Alto ahí, muchachas; ¿adónde escapáis porque un hombre nos salga?</w:t>
-      </w:r>
-      <w:r>
-        <w:br/>
-      </w:r>
-      <w:r>
-        <w:t xml:space="preserve">¿Pensáis acaso que es uno de esos que viene de malas?</w:t>
-      </w:r>
-      <w:r>
-        <w:br/>
-      </w:r>
-      <w:r>
-        <w:t xml:space="preserve">Aún no respira ese hombre mortal, y tal vez nunca nazca,</w:t>
-      </w:r>
-      <w:r>
-        <w:br/>
-      </w:r>
-      <w:r>
-        <w:t xml:space="preserve">que de los hombres feacios la tierra venga a tocarla</w:t>
-      </w:r>
-      <w:r>
-        <w:br/>
-      </w:r>
-      <w:r>
-        <w:t xml:space="preserve">trayendo calamidad: tanto y más los sin muerte nos guardan.</w:t>
-      </w:r>
-      <w:r>
-        <w:br/>
-      </w:r>
-      <w:r>
-        <w:t xml:space="preserve">Lejos, muy lejos vivimos, en la tempestuosa maralta,</w:t>
-      </w:r>
-      <w:r>
-        <w:br/>
-      </w:r>
-      <w:r>
-        <w:t xml:space="preserve">el fin del mundo, y con otros mortales no hay trato ni alianzas.</w:t>
-      </w:r>
-      <w:r>
-        <w:br/>
-      </w:r>
-      <w:r>
-        <w:t xml:space="preserve">Pero nos llega ahora un triste errabundo y debemos sin falta</w:t>
-      </w:r>
-      <w:r>
-        <w:br/>
-      </w:r>
-      <w:r>
-        <w:t xml:space="preserve">darle atención, pues que toda la gente mendiga o extraña</w:t>
-      </w:r>
-      <w:r>
-        <w:br/>
-      </w:r>
-      <w:r>
-        <w:t xml:space="preserve">gente es de Zeus, y el regalo que des, aun pequeño, le agrada.</w:t>
-      </w:r>
-      <w:r>
-        <w:br/>
-      </w:r>
-      <w:r>
-        <w:t xml:space="preserve">Dadle, así, esclavas, a este hombre extranjero bebida y pitanza, y</w:t>
-      </w:r>
-      <w:r>
-        <w:br/>
-      </w:r>
-      <w:r>
-        <w:t xml:space="preserve">bañadlo bien en el río, y que abrigo del viento allí haya».</w:t>
-      </w:r>
-    </w:p>
-    <w:p>
-      <w:pPr>
-        <w:pStyle w:val="FirstParagraph"/>
-      </w:pPr>
-      <w:r>
-        <w:t xml:space="preserve">Pero Ulises, pudoroso, le pide a las muchachas que le dejen arreglarse solo. Así lo hace, un poco apartado, y Atenea aprovecha para maquillarlo divinalmente, así que cuando sale a la vista, está hecho un brazo de mar.</w:t>
-      </w:r>
-    </w:p>
-    <w:p>
-      <w:pPr>
-        <w:pStyle w:val="BlockText"/>
-      </w:pPr>
-      <w:r>
-        <w:t xml:space="preserve">Fue él a sentarse después, apartándose un poco, a la playa,</w:t>
-      </w:r>
-      <w:r>
-        <w:br/>
-      </w:r>
-      <w:r>
-        <w:t xml:space="preserve">resplandeciente en gracia y belleza. Ella bien lo miraba.</w:t>
-      </w:r>
-      <w:r>
-        <w:br/>
-      </w:r>
-      <w:r>
-        <w:t xml:space="preserve">Y, contemplándolo, dijo a las ondulihermosas esclavas:</w:t>
-      </w:r>
-    </w:p>
-    <w:p>
-      <w:pPr>
-        <w:pStyle w:val="BlockText"/>
-      </w:pPr>
-      <w:r>
-        <w:t xml:space="preserve">«Niñas de brazos de leche, oíd lo que voy a deciros.</w:t>
-      </w:r>
-      <w:r>
-        <w:br/>
-      </w:r>
-      <w:r>
-        <w:t xml:space="preserve">No mal de grado de todos los dioses que alberga el Olimpo</w:t>
-      </w:r>
-      <w:r>
-        <w:br/>
-      </w:r>
-      <w:r>
-        <w:t xml:space="preserve">viene a encontrarse este hombre aquí con los feacios divinos;</w:t>
-      </w:r>
-      <w:r>
-        <w:br/>
-      </w:r>
-      <w:r>
-        <w:t xml:space="preserve">que es que creí que era un ser en verdad poco apuesto al principio,</w:t>
-      </w:r>
-      <w:r>
-        <w:br/>
-      </w:r>
-      <w:r>
-        <w:t xml:space="preserve">y ahora es igual a los dioses, del ancho cielo inquilinos.</w:t>
-      </w:r>
-      <w:r>
-        <w:br/>
-      </w:r>
-      <w:r>
-        <w:t xml:space="preserve">Ay, si uno así a mí me fuera llamado ya esposo mío</w:t>
-      </w:r>
-      <w:r>
-        <w:br/>
-      </w:r>
-      <w:r>
-        <w:t xml:space="preserve">viviendo aquí, porque en gusto quedarse por siempre le vino…</w:t>
-      </w:r>
-      <w:r>
-        <w:br/>
-      </w:r>
-      <w:r>
-        <w:t xml:space="preserve">Ah, dad comida y bebida, esclavas, al desconocido».</w:t>
-      </w:r>
-    </w:p>
-    <w:p>
-      <w:pPr>
-        <w:pStyle w:val="FirstParagraph"/>
-      </w:pPr>
-      <w:r>
-        <w:t xml:space="preserve">El patito (o más bien el ganso) feo se ha convertido en un apuesto galán por obra y gracia de Atenea, que de paso habrá aprovechado para quitarle alguna cana; tanto, que a la princesa le da por pensar que uno así no sería mal marido.</w:t>
-      </w:r>
-    </w:p>
-    <w:p>
-      <w:pPr>
-        <w:pStyle w:val="BodyText"/>
-      </w:pPr>
-      <w:r>
-        <w:t xml:space="preserve">Tan decidida como hermosa, enseguida informa al náufrago de que se dispone a llevarlo al palacio de su padre y le da instrucciones para entrar en la ciudad. Como no tiene un pelo de tonta, le avisa de que tienen que andarse alerta para evitar las malas lenguas que podrían decir algo como esto:</w:t>
-      </w:r>
-    </w:p>
-    <w:p>
-      <w:pPr>
-        <w:pStyle w:val="BlockText"/>
-      </w:pPr>
-      <w:r>
-        <w:t xml:space="preserve">«¿Quién será ese que sigue a Nausícaa, tan grande y garrido</w:t>
-      </w:r>
-      <w:r>
-        <w:br/>
-      </w:r>
-      <w:r>
-        <w:t xml:space="preserve">y forastero? ¿De dónde salió? Se me da que un marido.</w:t>
-      </w:r>
-      <w:r>
-        <w:br/>
-      </w:r>
-      <w:r>
-        <w:t xml:space="preserve">Sí, se lo habrá ella llevado cuando él se extravió del navío,</w:t>
-      </w:r>
-      <w:r>
-        <w:br/>
-      </w:r>
-      <w:r>
-        <w:t xml:space="preserve">que es de otra tierra, y lejana, que aquí no tenemos vecinos;</w:t>
-      </w:r>
-      <w:r>
-        <w:br/>
-      </w:r>
-      <w:r>
-        <w:t xml:space="preserve">o a ella, tras mucho rezar, algún dios biendeseado le vino</w:t>
-      </w:r>
-      <w:r>
-        <w:br/>
-      </w:r>
-      <w:r>
-        <w:t xml:space="preserve">caído del cielo, y por todos sus días lo tenga consigo.</w:t>
-      </w:r>
-      <w:r>
-        <w:br/>
-      </w:r>
-      <w:r>
-        <w:t xml:space="preserve">Tanto mejor si, rodando y rodando, a encontrar fue marido</w:t>
-      </w:r>
-      <w:r>
-        <w:br/>
-      </w:r>
-      <w:r>
-        <w:t xml:space="preserve">en otra parte, pues que a estos de aquí no los tiene por dignos,</w:t>
-      </w:r>
-      <w:r>
-        <w:br/>
-      </w:r>
-      <w:r>
-        <w:t xml:space="preserve">a los feacios, y muchos la rondan, y muy distinguidos».</w:t>
-      </w:r>
-    </w:p>
-    <w:p>
-      <w:pPr>
-        <w:pStyle w:val="FirstParagraph"/>
-      </w:pPr>
-      <w:r>
-        <w:t xml:space="preserve">El tema del matrimonio con el extranjero sigue dando vueltas en el relato, pero también el de la maledicencia, y eso que todavía no se habían inventado las redes sociales:</w:t>
-      </w:r>
-    </w:p>
-    <w:p>
-      <w:pPr>
-        <w:pStyle w:val="BlockText"/>
-      </w:pPr>
-      <w:r>
-        <w:t xml:space="preserve">Así dirán, y eso sí para mí que sería un ultraje.</w:t>
-      </w:r>
-      <w:r>
-        <w:br/>
-      </w:r>
-      <w:r>
-        <w:t xml:space="preserve">Y que lo viera yo en otra, a mí llegaría a indignarme,</w:t>
-      </w:r>
-      <w:r>
-        <w:br/>
-      </w:r>
-      <w:r>
-        <w:t xml:space="preserve">si ella a pesar de los suyos, viviéndole el padre y la madre,</w:t>
-      </w:r>
-      <w:r>
-        <w:br/>
-      </w:r>
-      <w:r>
-        <w:t xml:space="preserve">a hombre se ajunta, en lugar de ir a boda, y con pueblo delante.</w:t>
-      </w:r>
-    </w:p>
-    <w:p>
-      <w:pPr>
-        <w:pStyle w:val="FirstParagraph"/>
-      </w:pPr>
-      <w:r>
-        <w:t xml:space="preserve">Así que la princesa le pide a Odiseo que espere en un bosquecillo cercano para que no los vean llegar juntos. Después —le explica— podrá dirigirse al palacio de su padre y pedir audiencia. El canto VI termina de una manera curiosa y muy homérica. No olvidemos que Atenea lleva todo el episodio enredando. Pues bien, cuando Ulises se queda por fin solo en el bosque, le pide que le ayude a hacer amistad con los feacios:</w:t>
-      </w:r>
-    </w:p>
-    <w:p>
-      <w:pPr>
-        <w:pStyle w:val="BlockText"/>
-      </w:pPr>
-      <w:r>
-        <w:t xml:space="preserve">«Óyeme, cría de Zeus cabrilámpigo, tú, Intemerenda:</w:t>
-      </w:r>
-      <w:r>
-        <w:br/>
-      </w:r>
-      <w:r>
-        <w:t xml:space="preserve">préstame ahora el oído que no me prestaste cuando era</w:t>
-      </w:r>
-      <w:r>
-        <w:br/>
-      </w:r>
-      <w:r>
-        <w:t xml:space="preserve">un hombre roto cuando me rompía el que atrema la tierra.</w:t>
-      </w:r>
-      <w:r>
-        <w:br/>
-      </w:r>
-      <w:r>
-        <w:t xml:space="preserve">Hazme a los feacios amigo y digno de condolencia».</w:t>
-      </w:r>
-    </w:p>
-    <w:p>
-      <w:pPr>
-        <w:pStyle w:val="FirstParagraph"/>
-      </w:pPr>
-      <w:r>
-        <w:t xml:space="preserve">¿Y qué hace Atenea? Pues le da por acordarse de que tío Poseidón tiene muy malas pulgas y prefiere, por una vez, estarse quietecita:</w:t>
-      </w:r>
-    </w:p>
-    <w:p>
-      <w:pPr>
-        <w:pStyle w:val="BlockText"/>
-      </w:pPr>
-      <w:r>
-        <w:t xml:space="preserve">Dijo rezándole así, y Palas Atena lo oía.</w:t>
-      </w:r>
-      <w:r>
-        <w:br/>
-      </w:r>
-      <w:r>
-        <w:t xml:space="preserve">Pero a sus ojos no se apareció, pues respeto tenía</w:t>
-      </w:r>
-      <w:r>
-        <w:br/>
-      </w:r>
-      <w:r>
-        <w:t xml:space="preserve">a ese su tío de padre, tozudo en rencor todavía</w:t>
-      </w:r>
-      <w:r>
-        <w:br/>
-      </w:r>
-      <w:r>
-        <w:t xml:space="preserve">contra Odiseo pardiós, mientras diera en su tierra algún día.</w:t>
-      </w:r>
-    </w:p>
-    <w:p>
-      <w:pPr>
-        <w:pStyle w:val="FirstParagraph"/>
-      </w:pPr>
-      <w:r>
-        <w:t xml:space="preserve">En</w:t>
-      </w:r>
-      <w:r>
-        <w:t xml:space="preserve"> </w:t>
-      </w:r>
-      <w:r>
-        <w:rPr>
-          <w:i/>
-          <w:iCs/>
-        </w:rPr>
-        <w:t xml:space="preserve">Abandonando Ítaca</w:t>
-      </w:r>
-      <w:r>
-        <w:rPr>
-          <w:rStyle w:val="FootnoteReference"/>
-        </w:rPr>
-        <w:footnoteReference w:id="9"/>
-      </w:r>
-      <w:r>
-        <w:t xml:space="preserve">, me pongo en la piel de Odiseo, recordando en Ítaca aquella mañana de encuentros afortunados y aquel momento de soledad en el bosque sagrado de Atenea. A diferencia de Homero, que rara vez se demora en una introspección sostenida, mi viejo Ulises se debate entre la nostalgia y los remordimientos.</w:t>
-      </w:r>
-    </w:p>
-    <w:p>
-      <w:pPr>
-        <w:pStyle w:val="BlockText"/>
-      </w:pPr>
-      <w:r>
-        <w:t xml:space="preserve">Cada vez que cierras tus ojos al tenderte en la arena,</w:t>
-      </w:r>
-      <w:r>
-        <w:br/>
-      </w:r>
-      <w:r>
-        <w:t xml:space="preserve">la ves. A la hermosa princesa,</w:t>
-      </w:r>
-      <w:r>
-        <w:br/>
-      </w:r>
-      <w:r>
-        <w:t xml:space="preserve">jugando con sus criadas. Todas</w:t>
-      </w:r>
-      <w:r>
-        <w:br/>
-      </w:r>
-      <w:r>
-        <w:t xml:space="preserve">estaban desnudas, y su belleza te ahogaba,</w:t>
-      </w:r>
-      <w:r>
-        <w:br/>
-      </w:r>
-      <w:r>
-        <w:t xml:space="preserve">más que el azul desierto del que habías</w:t>
-      </w:r>
-      <w:r>
-        <w:br/>
-      </w:r>
-      <w:r>
-        <w:t xml:space="preserve">escapado por poco.</w:t>
-      </w:r>
-      <w:r>
-        <w:br/>
-      </w:r>
-      <w:r>
-        <w:t xml:space="preserve">No salió en estampida como las demás, ni fue tímida. En cambio, tú,</w:t>
-      </w:r>
-      <w:r>
-        <w:br/>
-      </w:r>
-      <w:r>
-        <w:t xml:space="preserve">que habías violado a muchas vírgenes,</w:t>
-      </w:r>
-      <w:r>
-        <w:br/>
-      </w:r>
-      <w:r>
-        <w:t xml:space="preserve">apenas podías pronunciar palabra. Es cierto que</w:t>
-      </w:r>
-      <w:r>
-        <w:br/>
-      </w:r>
-      <w:r>
-        <w:t xml:space="preserve">estabas también desnudo, pero no avergonzado</w:t>
-      </w:r>
-      <w:r>
-        <w:br/>
-      </w:r>
-      <w:r>
-        <w:t xml:space="preserve">de tu fuerte cuerpo. Tal vez fue algo nuevo,</w:t>
-      </w:r>
-      <w:r>
-        <w:br/>
-      </w:r>
-      <w:r>
-        <w:t xml:space="preserve">por primera vez viste lo que sus ojos vieron observándote,</w:t>
-      </w:r>
-      <w:r>
-        <w:br/>
-      </w:r>
-      <w:r>
-        <w:t xml:space="preserve">un mendigo, un náufrago, pidiendo clemencia.</w:t>
-      </w:r>
-    </w:p>
-    <w:p>
-      <w:pPr>
-        <w:pStyle w:val="FirstParagraph"/>
-      </w:pPr>
-      <w:r>
-        <w:t xml:space="preserve">Y no le queda otra que reconocer unos sentimientos que quizás negó incluso ante sí mismo en aquel momento.</w:t>
-      </w:r>
-    </w:p>
-    <w:p>
-      <w:pPr>
-        <w:pStyle w:val="BlockText"/>
-      </w:pPr>
-      <w:r>
-        <w:t xml:space="preserve">¿La amabas? Tal vez sí,</w:t>
-      </w:r>
-      <w:r>
-        <w:br/>
-      </w:r>
-      <w:r>
-        <w:t xml:space="preserve">pero nunca te atreviste a admitirlo,</w:t>
-      </w:r>
-      <w:r>
-        <w:br/>
-      </w:r>
-      <w:r>
-        <w:t xml:space="preserve">ni siquiera a ti mismo. En su lugar,</w:t>
-      </w:r>
-      <w:r>
-        <w:br/>
-      </w:r>
-      <w:r>
-        <w:t xml:space="preserve">noche tras noche seguías desgranando</w:t>
-      </w:r>
-      <w:r>
-        <w:br/>
-      </w:r>
-      <w:r>
-        <w:t xml:space="preserve">tus largas travesías y aventuras salvajes,</w:t>
-      </w:r>
-      <w:r>
-        <w:br/>
-      </w:r>
-      <w:r>
-        <w:t xml:space="preserve">el viaje sin fin que te había arrojado</w:t>
-      </w:r>
-      <w:r>
-        <w:br/>
-      </w:r>
-      <w:r>
-        <w:t xml:space="preserve">junto a sus costas.</w:t>
-      </w:r>
-    </w:p>
-    <w:p>
-      <w:pPr>
-        <w:pStyle w:val="FirstParagraph"/>
-      </w:pPr>
-      <w:r>
-        <w:t xml:space="preserve">Y cuestionarse —es el momento de cuestionárselo todo— si mantuvo su decisión de volver a casa por convicción o cobardía.</w:t>
-      </w:r>
-    </w:p>
-    <w:p>
-      <w:pPr>
-        <w:pStyle w:val="BlockText"/>
-      </w:pPr>
-      <w:r>
-        <w:t xml:space="preserve">¿Tomaste en consideración quedarte?</w:t>
-      </w:r>
-      <w:r>
-        <w:br/>
-      </w:r>
-      <w:r>
-        <w:t xml:space="preserve">Su padre habría estado contento de casar a su hija</w:t>
-      </w:r>
-      <w:r>
-        <w:br/>
-      </w:r>
-      <w:r>
-        <w:t xml:space="preserve">con el último héroe que quedaba de Troya.</w:t>
-      </w:r>
-      <w:r>
-        <w:br/>
-      </w:r>
-      <w:r>
-        <w:t xml:space="preserve">Pero decidiste volver,</w:t>
-      </w:r>
-      <w:r>
-        <w:br/>
-      </w:r>
-      <w:r>
-        <w:t xml:space="preserve">por el bien de Penélope.</w:t>
-      </w:r>
-      <w:r>
-        <w:br/>
-      </w:r>
-      <w:r>
-        <w:t xml:space="preserve">¿O fue otra la razón?</w:t>
-      </w:r>
-      <w:r>
-        <w:br/>
-      </w:r>
-      <w:r>
-        <w:t xml:space="preserve">Tal vez sencillamente no pudiste olvidar lo que viste en su rostro:</w:t>
-      </w:r>
-      <w:r>
-        <w:br/>
-      </w:r>
-      <w:r>
-        <w:t xml:space="preserve">una joven sintiendo compasión por un anciano.</w:t>
-      </w:r>
-    </w:p>
-    <w:p>
-      <w:pPr>
-        <w:pStyle w:val="FirstParagraph"/>
-      </w:pPr>
-      <w:r>
-        <w:t xml:space="preserve">Nausícaa, como todas las mujeres de la</w:t>
-      </w:r>
-      <w:r>
-        <w:t xml:space="preserve"> </w:t>
-      </w:r>
-      <w:r>
-        <w:rPr>
-          <w:i/>
-          <w:iCs/>
-        </w:rPr>
-        <w:t xml:space="preserve">Odisea</w:t>
-      </w:r>
-      <w:r>
-        <w:t xml:space="preserve">, es polifacética y uno de los ángulos que muestra su historia es el de la posibilidad —o no— de una relación amorosa entre una muchacha de quince años y un hombre mayor que le lleva tres o cuatro décadas. Homero se adelanta a Nabokov en tres milenios, pero la princesa de los feacios no tiene nada de Lolita.</w:t>
-      </w:r>
-    </w:p>
-    <w:p>
-      <w:pPr>
-        <w:pStyle w:val="BodyText"/>
-      </w:pPr>
-      <w:r>
-        <w:t xml:space="preserve">Nausícaa es el amor imposible por partida doble. No solo la pierde el héroe atormentado y ya canoso que arriba a sus costas. La pierde también el adolescente que fui un día, el adolescente afiebrado que se quería poner en la piel de Ulises, como si un cordero pudiera suplantar a un león. Nausícaa es tan universal como Helena y Penélope, como Calipso y Circe, y lo es porque todos guardamos en nuestro corazón la imagen de esa muchacha que un día nos dedicó una sonrisa, una mirada, puede que un beso. Todos atesoramos, como un dulce y lacerante filtro, ese amor que pudo ser y no fue. Todos seguimos amando a Nausícaa.</w:t>
+        <w:t xml:space="preserve">Nausícaa es el amor imposible por partida doble. No solo la pierde el héroe atormentado y ya canoso que arriba a sus costas. La pierde también el adolescente afiebrado que se quería poner en la piel de Ulises, como si un cordero pudiera suplantar a un león. Nausícaa es tan universal como Helena y Penélope, como Calipso y Circe, y lo es porque todos guardamos en nuestro corazón la imagen de esa muchacha que un día nos dedicó una sonrisa, una mirada, puede que un beso. Todos atesoramos, como un dulce y lacerante filtro, ese amor que pudo ser y no fue. Todos seguimos amando a Nausícaa.</w:t>
       </w:r>
     </w:p>
     <w:sectPr>
@@ -1765,30 +1705,6 @@
       <w:r>
         <w:separator/>
       </w:r>
-    </w:p>
-  </w:footnote>
-  <w:footnote w:id="9">
-    <w:p>
-      <w:pPr>
-        <w:pStyle w:val="FootnoteText"/>
-      </w:pPr>
-      <w:r>
-        <w:rPr>
-          <w:rStyle w:val="FootnoteReference"/>
-        </w:rPr>
-        <w:footnoteRef/>
-      </w:r>
-      <w:r>
-        <w:t xml:space="preserve"> </w:t>
-      </w:r>
-      <w:hyperlink r:id="rId10">
-        <w:r>
-          <w:rPr>
-            <w:rStyle w:val="Hyperlink"/>
-          </w:rPr>
-          <w:t xml:space="preserve">https://eolasediciones.es/libro/abandonando-itaca-leaving-ithaca/</w:t>
-        </w:r>
-      </w:hyperlink>
     </w:p>
   </w:footnote>
 </w:footnotes>

</xml_diff>